<commit_message>
Fondos de empleados: convenio en variante ENTIDAD (afiliados), carta de postulacion con calidad del postulado (colaborador, conyuge, hijo desde 12) y colaborador que respalda; presentacion con inicio 3 de noviembre sin pausa en diciembre y beca para conyuge e hijos
Co-Authored-By: Claude Fable 5.1 <noreply@anthropic.com>
</commit_message>
<xml_diff>
--- a/recursos/comercial/B2B/CARTA_POSTULACION_EMPRESA_ALIADA.docx
+++ b/recursos/comercial/B2B/CARTA_POSTULACION_EMPRESA_ALIADA.docx
@@ -70,7 +70,7 @@
     </w:p>
     <w:p>
       <w:pPr>
-        <w:spacing w:after="200"/>
+        <w:spacing w:after="120"/>
       </w:pPr>
       <w:r>
         <w:rPr>
@@ -79,9 +79,31 @@
         </w:rPr>
         <w:t>Nombre completo: ______________________________________________</w:t>
         <w:br/>
-        <w:t>Cédula: ______________________   Cargo: ______________________________</w:t>
-        <w:br/>
-        <w:t>Celular: ______________________   Correo: ______________________________</w:t>
+        <w:t>Cédula: ______________________   Celular: ______________________   Correo: ______________________________</w:t>
+      </w:r>
+    </w:p>
+    <w:p>
+      <w:pPr>
+        <w:spacing w:after="120"/>
+      </w:pPr>
+      <w:r>
+        <w:rPr>
+          <w:b w:val="0"/>
+          <w:sz w:val="22"/>
+        </w:rPr>
+        <w:t>Postulado en calidad de:   ☐ colaborador de la empresa (cargo: ____________________)   ☐ cónyuge del colaborador   ☐ hijo o hija del colaborador (desde los 12 años; si es menor de edad, firma el acudiente)</w:t>
+      </w:r>
+    </w:p>
+    <w:p>
+      <w:pPr>
+        <w:spacing w:after="200"/>
+      </w:pPr>
+      <w:r>
+        <w:rPr>
+          <w:b w:val="0"/>
+          <w:sz w:val="22"/>
+        </w:rPr>
+        <w:t>Si el postulado es familiar, colaborador que lo respalda: ______________________________________   Cédula: ______________________   Cargo: ______________________</w:t>
       </w:r>
     </w:p>
     <w:p>
@@ -93,7 +115,7 @@
           <w:b w:val="0"/>
           <w:sz w:val="22"/>
         </w:rPr>
-        <w:t>para que acceda, como colaborador de nuestra empresa, al beneficio de la alianza: la beca del Fondo de Becas de la academia en la columna de alianza, aplicable al programa que el colaborador elija.</w:t>
+        <w:t>para que acceda, como colaborador de nuestra empresa o como familiar de nuestro colaborador, al beneficio de la alianza: la beca del Fondo de Becas de la academia en la columna de alianza, aplicable al programa que el postulado elija (Convenio, cláusula 2).</w:t>
       </w:r>
     </w:p>
     <w:p>
@@ -105,7 +127,7 @@
           <w:b w:val="0"/>
           <w:sz w:val="22"/>
         </w:rPr>
-        <w:t>Esta postulación no genera obligación económica ni responsabilidad alguna para la empresa. El contrato de matrícula, sus condiciones académicas y de pago los asume directamente el colaborador. La empresa autoriza a la academia a reportarle únicamente asistencia y cumplimiento del colaborador, nunca calificaciones.</w:t>
+        <w:t>Esta postulación no genera obligación económica ni responsabilidad alguna para la empresa. El contrato de matrícula, sus condiciones académicas y de pago los asume directamente el postulado (o su acudiente). La empresa autoriza a la academia a reportarle únicamente asistencia y cumplimiento del postulado, nunca calificaciones.</w:t>
       </w:r>
     </w:p>
     <w:p>
@@ -148,7 +170,7 @@
           <w:color w:val="666666"/>
           <w:sz w:val="18"/>
         </w:rPr>
-        <w:t>Uso interno de la academia: esta carta se entrega en la sede junto con el contrato de matrícula del colaborador. Una carta por colaborador. Sin carta vigente no aplica la beca de alianza.</w:t>
+        <w:t>Uso interno de la academia: esta carta se entrega en la sede junto con el contrato de matrícula del postulado. Una carta por persona postulada (colaborador o familiar). Las becas a familiares cuentan dentro del mismo cupo trimestral de la empresa. Sin carta vigente no aplica la beca de alianza.</w:t>
       </w:r>
     </w:p>
     <w:sectPr>

</xml_diff>